<commit_message>
Endurece o termo de responsabilidade (v4) sem clausulas anulaveis
Financiamento como meio de pagamento e nao condicao do contrato, diferenca
de valor aprovado ou subsidio a cargo do comprador, rubrica em cada item
explicado, reprovacao e perda de renda como motivos ligados ao comprador,
prazo unico de 30 dias, chaves so apos o pagamento, autorizacao de consulta
ao SCR e clausula de conservacao. Parecer ganha a secao de brechas
fechadas e dos limites que nao podem entrar no termo.

Co-Authored-By: Claude Opus 5.5 <noreply@anthropic.com>
Claude-Session: https://claude.ai/code/session_01Vke3PfuNi2WMa8Y1enPjwp
</commit_message>
<xml_diff>
--- a/politica-credito/Parecer_Revisao_Juridica.docx
+++ b/politica-credito/Parecer_Revisao_Juridica.docx
@@ -244,7 +244,7 @@
           <w:sz w:val="20"/>
           <w:szCs w:val="20"/>
         </w:rPr>
-        <w:t xml:space="preserve"> e seis ajustes importantes. Todos foram corrigidos na </w:t>
+        <w:t xml:space="preserve"> e seis ajustes importantes. Todos foram corrigidos. A pedido da empresa, o Termo foi depois endurecido na </w:t>
       </w:r>
       <w:r>
         <w:rPr>
@@ -254,33 +254,15 @@
           <w:sz w:val="20"/>
           <w:szCs w:val="20"/>
         </w:rPr>
-        <w:t xml:space="preserve">versão 3 do Termo</w:t>
-      </w:r>
-      <w:r>
-        <w:rPr>
-          <w:rFonts w:ascii="Arial" w:cs="Arial" w:eastAsia="Arial" w:hAnsi="Arial"/>
-          <w:sz w:val="20"/>
-          <w:szCs w:val="20"/>
-        </w:rPr>
-        <w:t xml:space="preserve"> e na </w:t>
-      </w:r>
-      <w:r>
-        <w:rPr>
-          <w:rFonts w:ascii="Arial" w:cs="Arial" w:eastAsia="Arial" w:hAnsi="Arial"/>
-          <w:b/>
-          <w:bCs/>
-          <w:sz w:val="20"/>
-          <w:szCs w:val="20"/>
-        </w:rPr>
-        <w:t xml:space="preserve">versão 3 da Política</w:t>
-      </w:r>
-      <w:r>
-        <w:rPr>
-          <w:rFonts w:ascii="Arial" w:cs="Arial" w:eastAsia="Arial" w:hAnsi="Arial"/>
-          <w:sz w:val="20"/>
-          <w:szCs w:val="20"/>
-        </w:rPr>
-        <w:t xml:space="preserve">, entregues junto com este parecer.</w:t>
+        <w:t xml:space="preserve">versão 4</w:t>
+      </w:r>
+      <w:r>
+        <w:rPr>
+          <w:rFonts w:ascii="Arial" w:cs="Arial" w:eastAsia="Arial" w:hAnsi="Arial"/>
+          <w:sz w:val="20"/>
+          <w:szCs w:val="20"/>
+        </w:rPr>
+        <w:t xml:space="preserve"> (seção 6), fechando as brechas que a defesa de um comprador exploraria, sem incluir cláusulas que um juiz anularia.</w:t>
       </w:r>
     </w:p>
     <w:p>
@@ -1101,15 +1083,15 @@
                 <w:sz w:val="18"/>
                 <w:szCs w:val="18"/>
               </w:rPr>
-              <w:t xml:space="preserve">dever de avisar em 15 dias</w:t>
-            </w:r>
-            <w:r>
-              <w:rPr>
-                <w:rFonts w:ascii="Arial" w:cs="Arial" w:eastAsia="Arial" w:hAnsi="Arial"/>
-                <w:sz w:val="18"/>
-                <w:szCs w:val="18"/>
-              </w:rPr>
-              <w:t xml:space="preserve"> e ciência do risco. O teto de 35% fica só na política interna.</w:t>
+              <w:t xml:space="preserve">aviso prévio por escrito</w:t>
+            </w:r>
+            <w:r>
+              <w:rPr>
+                <w:rFonts w:ascii="Arial" w:cs="Arial" w:eastAsia="Arial" w:hAnsi="Arial"/>
+                <w:sz w:val="18"/>
+                <w:szCs w:val="18"/>
+              </w:rPr>
+              <w:t xml:space="preserve">, com o risco da nova dívida assumido pelo comprador. O teto de 35% fica só na política interna.</w:t>
             </w:r>
           </w:p>
         </w:tc>
@@ -2971,7 +2953,1379 @@
           <w:sz w:val="24"/>
           <w:szCs w:val="24"/>
         </w:rPr>
-        <w:t xml:space="preserve">5. Normas e jurisprudência consultadas</w:t>
+        <w:t xml:space="preserve">5. Termo v4: brechas fechadas</w:t>
+      </w:r>
+    </w:p>
+    <w:tbl>
+      <w:tblPr>
+        <w:tblW w:type="dxa" w:w="10206"/>
+        <w:tblBorders>
+          <w:top w:val="single" w:color="auto" w:sz="4"/>
+          <w:left w:val="single" w:color="auto" w:sz="4"/>
+          <w:bottom w:val="single" w:color="auto" w:sz="4"/>
+          <w:right w:val="single" w:color="auto" w:sz="4"/>
+          <w:insideH w:val="single" w:color="auto" w:sz="4"/>
+          <w:insideV w:val="single" w:color="auto" w:sz="4"/>
+        </w:tblBorders>
+      </w:tblPr>
+      <w:tblGrid>
+        <w:gridCol w:w="3878"/>
+        <w:gridCol w:w="6328"/>
+      </w:tblGrid>
+      <w:tr>
+        <w:trPr>
+          <w:tblHeader/>
+        </w:trPr>
+        <w:tc>
+          <w:tcPr>
+            <w:tcW w:type="dxa" w:w="3878"/>
+            <w:tcBorders>
+              <w:top w:val="single" w:color="BFBFBF" w:sz="4"/>
+              <w:left w:val="single" w:color="BFBFBF" w:sz="4"/>
+              <w:bottom w:val="single" w:color="BFBFBF" w:sz="4"/>
+              <w:right w:val="single" w:color="BFBFBF" w:sz="4"/>
+            </w:tcBorders>
+            <w:shd w:fill="1F3864" w:color="auto" w:val="clear"/>
+            <w:tcMar>
+              <w:top w:type="dxa" w:w="80"/>
+              <w:left w:type="dxa" w:w="120"/>
+              <w:bottom w:type="dxa" w:w="80"/>
+              <w:right w:type="dxa" w:w="120"/>
+            </w:tcMar>
+            <w:vAlign w:val="top"/>
+          </w:tcPr>
+          <w:p>
+            <w:pPr>
+              <w:spacing w:after="0" w:before="0" w:line="264"/>
+              <w:jc w:val="left"/>
+            </w:pPr>
+            <w:r>
+              <w:rPr>
+                <w:rFonts w:ascii="Arial" w:cs="Arial" w:eastAsia="Arial" w:hAnsi="Arial"/>
+                <w:b/>
+                <w:bCs/>
+                <w:color w:val="FFFFFF"/>
+                <w:sz w:val="18"/>
+                <w:szCs w:val="18"/>
+              </w:rPr>
+              <w:t xml:space="preserve">Brecha que o comprador poderia usar</w:t>
+            </w:r>
+          </w:p>
+        </w:tc>
+        <w:tc>
+          <w:tcPr>
+            <w:tcW w:type="dxa" w:w="6328"/>
+            <w:tcBorders>
+              <w:top w:val="single" w:color="BFBFBF" w:sz="4"/>
+              <w:left w:val="single" w:color="BFBFBF" w:sz="4"/>
+              <w:bottom w:val="single" w:color="BFBFBF" w:sz="4"/>
+              <w:right w:val="single" w:color="BFBFBF" w:sz="4"/>
+            </w:tcBorders>
+            <w:shd w:fill="1F3864" w:color="auto" w:val="clear"/>
+            <w:tcMar>
+              <w:top w:type="dxa" w:w="80"/>
+              <w:left w:type="dxa" w:w="120"/>
+              <w:bottom w:type="dxa" w:w="80"/>
+              <w:right w:type="dxa" w:w="120"/>
+            </w:tcMar>
+            <w:vAlign w:val="top"/>
+          </w:tcPr>
+          <w:p>
+            <w:pPr>
+              <w:spacing w:after="0" w:before="0" w:line="264"/>
+              <w:jc w:val="left"/>
+            </w:pPr>
+            <w:r>
+              <w:rPr>
+                <w:rFonts w:ascii="Arial" w:cs="Arial" w:eastAsia="Arial" w:hAnsi="Arial"/>
+                <w:b/>
+                <w:bCs/>
+                <w:color w:val="FFFFFF"/>
+                <w:sz w:val="18"/>
+                <w:szCs w:val="18"/>
+              </w:rPr>
+              <w:t xml:space="preserve">Como a v4 fecha</w:t>
+            </w:r>
+          </w:p>
+        </w:tc>
+      </w:tr>
+      <w:tr>
+        <w:trPr>
+          <w:cantSplit/>
+        </w:trPr>
+        <w:tc>
+          <w:tcPr>
+            <w:tcW w:type="dxa" w:w="3878"/>
+            <w:tcBorders>
+              <w:top w:val="single" w:color="BFBFBF" w:sz="4"/>
+              <w:left w:val="single" w:color="BFBFBF" w:sz="4"/>
+              <w:bottom w:val="single" w:color="BFBFBF" w:sz="4"/>
+              <w:right w:val="single" w:color="BFBFBF" w:sz="4"/>
+            </w:tcBorders>
+            <w:tcMar>
+              <w:top w:type="dxa" w:w="80"/>
+              <w:left w:type="dxa" w:w="120"/>
+              <w:bottom w:type="dxa" w:w="80"/>
+              <w:right w:type="dxa" w:w="120"/>
+            </w:tcMar>
+            <w:vAlign w:val="top"/>
+          </w:tcPr>
+          <w:p>
+            <w:pPr>
+              <w:spacing w:after="20" w:before="0" w:line="264"/>
+              <w:jc w:val="left"/>
+            </w:pPr>
+            <w:r>
+              <w:rPr>
+                <w:rFonts w:ascii="Arial" w:cs="Arial" w:eastAsia="Arial" w:hAnsi="Arial"/>
+                <w:b/>
+                <w:bCs/>
+                <w:sz w:val="18"/>
+                <w:szCs w:val="18"/>
+              </w:rPr>
+              <w:t xml:space="preserve">"O financiamento era condição do negócio; se não saiu, devolvam tudo."</w:t>
+            </w:r>
+          </w:p>
+        </w:tc>
+        <w:tc>
+          <w:tcPr>
+            <w:tcW w:type="dxa" w:w="6328"/>
+            <w:tcBorders>
+              <w:top w:val="single" w:color="BFBFBF" w:sz="4"/>
+              <w:left w:val="single" w:color="BFBFBF" w:sz="4"/>
+              <w:bottom w:val="single" w:color="BFBFBF" w:sz="4"/>
+              <w:right w:val="single" w:color="BFBFBF" w:sz="4"/>
+            </w:tcBorders>
+            <w:tcMar>
+              <w:top w:type="dxa" w:w="80"/>
+              <w:left w:type="dxa" w:w="120"/>
+              <w:bottom w:type="dxa" w:w="80"/>
+              <w:right w:type="dxa" w:w="120"/>
+            </w:tcMar>
+            <w:vAlign w:val="top"/>
+          </w:tcPr>
+          <w:p>
+            <w:pPr>
+              <w:spacing w:after="20" w:before="0" w:line="264"/>
+              <w:jc w:val="left"/>
+            </w:pPr>
+            <w:r>
+              <w:rPr>
+                <w:rFonts w:ascii="Arial" w:cs="Arial" w:eastAsia="Arial" w:hAnsi="Arial"/>
+                <w:b w:val="false"/>
+                <w:bCs w:val="false"/>
+                <w:sz w:val="18"/>
+                <w:szCs w:val="18"/>
+              </w:rPr>
+              <w:t xml:space="preserve">Item 1: o financiamento é </w:t>
+            </w:r>
+            <w:r>
+              <w:rPr>
+                <w:rFonts w:ascii="Arial" w:cs="Arial" w:eastAsia="Arial" w:hAnsi="Arial"/>
+                <w:b/>
+                <w:bCs/>
+                <w:sz w:val="18"/>
+                <w:szCs w:val="18"/>
+              </w:rPr>
+              <w:t xml:space="preserve">meio de pagamento escolhido pelo comprador</w:t>
+            </w:r>
+            <w:r>
+              <w:rPr>
+                <w:rFonts w:ascii="Arial" w:cs="Arial" w:eastAsia="Arial" w:hAnsi="Arial"/>
+                <w:b w:val="false"/>
+                <w:bCs w:val="false"/>
+                <w:sz w:val="18"/>
+                <w:szCs w:val="18"/>
+              </w:rPr>
+              <w:t xml:space="preserve">, e a aprovação </w:t>
+            </w:r>
+            <w:r>
+              <w:rPr>
+                <w:rFonts w:ascii="Arial" w:cs="Arial" w:eastAsia="Arial" w:hAnsi="Arial"/>
+                <w:b/>
+                <w:bCs/>
+                <w:sz w:val="18"/>
+                <w:szCs w:val="18"/>
+              </w:rPr>
+              <w:t xml:space="preserve">não é condição</w:t>
+            </w:r>
+            <w:r>
+              <w:rPr>
+                <w:rFonts w:ascii="Arial" w:cs="Arial" w:eastAsia="Arial" w:hAnsi="Arial"/>
+                <w:b w:val="false"/>
+                <w:bCs w:val="false"/>
+                <w:sz w:val="18"/>
+                <w:szCs w:val="18"/>
+              </w:rPr>
+              <w:t xml:space="preserve"> do contrato. O saldo é devido de qualquer forma.</w:t>
+            </w:r>
+          </w:p>
+        </w:tc>
+      </w:tr>
+      <w:tr>
+        <w:trPr>
+          <w:cantSplit/>
+        </w:trPr>
+        <w:tc>
+          <w:tcPr>
+            <w:tcW w:type="dxa" w:w="3878"/>
+            <w:tcBorders>
+              <w:top w:val="single" w:color="BFBFBF" w:sz="4"/>
+              <w:left w:val="single" w:color="BFBFBF" w:sz="4"/>
+              <w:bottom w:val="single" w:color="BFBFBF" w:sz="4"/>
+              <w:right w:val="single" w:color="BFBFBF" w:sz="4"/>
+            </w:tcBorders>
+            <w:tcMar>
+              <w:top w:type="dxa" w:w="80"/>
+              <w:left w:type="dxa" w:w="120"/>
+              <w:bottom w:type="dxa" w:w="80"/>
+              <w:right w:type="dxa" w:w="120"/>
+            </w:tcMar>
+            <w:vAlign w:val="top"/>
+          </w:tcPr>
+          <w:p>
+            <w:pPr>
+              <w:spacing w:after="20" w:before="0" w:line="264"/>
+              <w:jc w:val="left"/>
+            </w:pPr>
+            <w:r>
+              <w:rPr>
+                <w:rFonts w:ascii="Arial" w:cs="Arial" w:eastAsia="Arial" w:hAnsi="Arial"/>
+                <w:b/>
+                <w:bCs/>
+                <w:sz w:val="18"/>
+                <w:szCs w:val="18"/>
+              </w:rPr>
+              <w:t xml:space="preserve">"Ninguém me explicou os requisitos." (argumento que mais leva a devolução integral)</w:t>
+            </w:r>
+          </w:p>
+        </w:tc>
+        <w:tc>
+          <w:tcPr>
+            <w:tcW w:type="dxa" w:w="6328"/>
+            <w:tcBorders>
+              <w:top w:val="single" w:color="BFBFBF" w:sz="4"/>
+              <w:left w:val="single" w:color="BFBFBF" w:sz="4"/>
+              <w:bottom w:val="single" w:color="BFBFBF" w:sz="4"/>
+              <w:right w:val="single" w:color="BFBFBF" w:sz="4"/>
+            </w:tcBorders>
+            <w:tcMar>
+              <w:top w:type="dxa" w:w="80"/>
+              <w:left w:type="dxa" w:w="120"/>
+              <w:bottom w:type="dxa" w:w="80"/>
+              <w:right w:type="dxa" w:w="120"/>
+            </w:tcMar>
+            <w:vAlign w:val="top"/>
+          </w:tcPr>
+          <w:p>
+            <w:pPr>
+              <w:spacing w:after="20" w:before="0" w:line="264"/>
+              <w:jc w:val="left"/>
+            </w:pPr>
+            <w:r>
+              <w:rPr>
+                <w:rFonts w:ascii="Arial" w:cs="Arial" w:eastAsia="Arial" w:hAnsi="Arial"/>
+                <w:b w:val="false"/>
+                <w:bCs w:val="false"/>
+                <w:sz w:val="18"/>
+                <w:szCs w:val="18"/>
+              </w:rPr>
+              <w:t xml:space="preserve">Item 2: cada ponto explicado tem </w:t>
+            </w:r>
+            <w:r>
+              <w:rPr>
+                <w:rFonts w:ascii="Arial" w:cs="Arial" w:eastAsia="Arial" w:hAnsi="Arial"/>
+                <w:b/>
+                <w:bCs/>
+                <w:sz w:val="18"/>
+                <w:szCs w:val="18"/>
+              </w:rPr>
+              <w:t xml:space="preserve">rubrica própria</w:t>
+            </w:r>
+            <w:r>
+              <w:rPr>
+                <w:rFonts w:ascii="Arial" w:cs="Arial" w:eastAsia="Arial" w:hAnsi="Arial"/>
+                <w:b w:val="false"/>
+                <w:bCs w:val="false"/>
+                <w:sz w:val="18"/>
+                <w:szCs w:val="18"/>
+              </w:rPr>
+              <w:t xml:space="preserve">, incluindo o resultado e o valor da análise prévia.</w:t>
+            </w:r>
+          </w:p>
+        </w:tc>
+      </w:tr>
+      <w:tr>
+        <w:trPr>
+          <w:cantSplit/>
+        </w:trPr>
+        <w:tc>
+          <w:tcPr>
+            <w:tcW w:type="dxa" w:w="3878"/>
+            <w:tcBorders>
+              <w:top w:val="single" w:color="BFBFBF" w:sz="4"/>
+              <w:left w:val="single" w:color="BFBFBF" w:sz="4"/>
+              <w:bottom w:val="single" w:color="BFBFBF" w:sz="4"/>
+              <w:right w:val="single" w:color="BFBFBF" w:sz="4"/>
+            </w:tcBorders>
+            <w:tcMar>
+              <w:top w:type="dxa" w:w="80"/>
+              <w:left w:type="dxa" w:w="120"/>
+              <w:bottom w:type="dxa" w:w="80"/>
+              <w:right w:type="dxa" w:w="120"/>
+            </w:tcMar>
+            <w:vAlign w:val="top"/>
+          </w:tcPr>
+          <w:p>
+            <w:pPr>
+              <w:spacing w:after="20" w:before="0" w:line="264"/>
+              <w:jc w:val="left"/>
+            </w:pPr>
+            <w:r>
+              <w:rPr>
+                <w:rFonts w:ascii="Arial" w:cs="Arial" w:eastAsia="Arial" w:hAnsi="Arial"/>
+                <w:b/>
+                <w:bCs/>
+                <w:sz w:val="18"/>
+                <w:szCs w:val="18"/>
+              </w:rPr>
+              <w:t xml:space="preserve">"A Caixa aprovou menos / o subsídio caiu, então não consigo pagar."</w:t>
+            </w:r>
+          </w:p>
+        </w:tc>
+        <w:tc>
+          <w:tcPr>
+            <w:tcW w:type="dxa" w:w="6328"/>
+            <w:tcBorders>
+              <w:top w:val="single" w:color="BFBFBF" w:sz="4"/>
+              <w:left w:val="single" w:color="BFBFBF" w:sz="4"/>
+              <w:bottom w:val="single" w:color="BFBFBF" w:sz="4"/>
+              <w:right w:val="single" w:color="BFBFBF" w:sz="4"/>
+            </w:tcBorders>
+            <w:tcMar>
+              <w:top w:type="dxa" w:w="80"/>
+              <w:left w:type="dxa" w:w="120"/>
+              <w:bottom w:type="dxa" w:w="80"/>
+              <w:right w:type="dxa" w:w="120"/>
+            </w:tcMar>
+            <w:vAlign w:val="top"/>
+          </w:tcPr>
+          <w:p>
+            <w:pPr>
+              <w:spacing w:after="20" w:before="0" w:line="264"/>
+              <w:jc w:val="left"/>
+            </w:pPr>
+            <w:r>
+              <w:rPr>
+                <w:rFonts w:ascii="Arial" w:cs="Arial" w:eastAsia="Arial" w:hAnsi="Arial"/>
+                <w:b w:val="false"/>
+                <w:bCs w:val="false"/>
+                <w:sz w:val="18"/>
+                <w:szCs w:val="18"/>
+              </w:rPr>
+              <w:t xml:space="preserve">Item 1.3: diferença de valor ou de subsídio é paga pelo comprador no mesmo prazo.</w:t>
+            </w:r>
+          </w:p>
+        </w:tc>
+      </w:tr>
+      <w:tr>
+        <w:trPr>
+          <w:cantSplit/>
+        </w:trPr>
+        <w:tc>
+          <w:tcPr>
+            <w:tcW w:type="dxa" w:w="3878"/>
+            <w:tcBorders>
+              <w:top w:val="single" w:color="BFBFBF" w:sz="4"/>
+              <w:left w:val="single" w:color="BFBFBF" w:sz="4"/>
+              <w:bottom w:val="single" w:color="BFBFBF" w:sz="4"/>
+              <w:right w:val="single" w:color="BFBFBF" w:sz="4"/>
+            </w:tcBorders>
+            <w:tcMar>
+              <w:top w:type="dxa" w:w="80"/>
+              <w:left w:type="dxa" w:w="120"/>
+              <w:bottom w:type="dxa" w:w="80"/>
+              <w:right w:type="dxa" w:w="120"/>
+            </w:tcMar>
+            <w:vAlign w:val="top"/>
+          </w:tcPr>
+          <w:p>
+            <w:pPr>
+              <w:spacing w:after="20" w:before="0" w:line="264"/>
+              <w:jc w:val="left"/>
+            </w:pPr>
+            <w:r>
+              <w:rPr>
+                <w:rFonts w:ascii="Arial" w:cs="Arial" w:eastAsia="Arial" w:hAnsi="Arial"/>
+                <w:b/>
+                <w:bCs/>
+                <w:sz w:val="18"/>
+                <w:szCs w:val="18"/>
+              </w:rPr>
+              <w:t xml:space="preserve">"Fui reprovado sem ter restrição, não tenho culpa."</w:t>
+            </w:r>
+          </w:p>
+        </w:tc>
+        <w:tc>
+          <w:tcPr>
+            <w:tcW w:type="dxa" w:w="6328"/>
+            <w:tcBorders>
+              <w:top w:val="single" w:color="BFBFBF" w:sz="4"/>
+              <w:left w:val="single" w:color="BFBFBF" w:sz="4"/>
+              <w:bottom w:val="single" w:color="BFBFBF" w:sz="4"/>
+              <w:right w:val="single" w:color="BFBFBF" w:sz="4"/>
+            </w:tcBorders>
+            <w:tcMar>
+              <w:top w:type="dxa" w:w="80"/>
+              <w:left w:type="dxa" w:w="120"/>
+              <w:bottom w:type="dxa" w:w="80"/>
+              <w:right w:type="dxa" w:w="120"/>
+            </w:tcMar>
+            <w:vAlign w:val="top"/>
+          </w:tcPr>
+          <w:p>
+            <w:pPr>
+              <w:spacing w:after="20" w:before="0" w:line="264"/>
+              <w:jc w:val="left"/>
+            </w:pPr>
+            <w:r>
+              <w:rPr>
+                <w:rFonts w:ascii="Arial" w:cs="Arial" w:eastAsia="Arial" w:hAnsi="Arial"/>
+                <w:b w:val="false"/>
+                <w:bCs w:val="false"/>
+                <w:sz w:val="18"/>
+                <w:szCs w:val="18"/>
+              </w:rPr>
+              <w:t xml:space="preserve">Item 7: reprovação por renda, cadastro, análise de risco, documentação ou enquadramento entra nos </w:t>
+            </w:r>
+            <w:r>
+              <w:rPr>
+                <w:rFonts w:ascii="Arial" w:cs="Arial" w:eastAsia="Arial" w:hAnsi="Arial"/>
+                <w:b/>
+                <w:bCs/>
+                <w:sz w:val="18"/>
+                <w:szCs w:val="18"/>
+              </w:rPr>
+              <w:t xml:space="preserve">motivos ligados ao comprador</w:t>
+            </w:r>
+            <w:r>
+              <w:rPr>
+                <w:rFonts w:ascii="Arial" w:cs="Arial" w:eastAsia="Arial" w:hAnsi="Arial"/>
+                <w:b w:val="false"/>
+                <w:bCs w:val="false"/>
+                <w:sz w:val="18"/>
+                <w:szCs w:val="18"/>
+              </w:rPr>
+              <w:t xml:space="preserve">. Só ficam fora problemas da vendedora/imóvel e mudança de lei posterior.</w:t>
+            </w:r>
+          </w:p>
+        </w:tc>
+      </w:tr>
+      <w:tr>
+        <w:trPr>
+          <w:cantSplit/>
+        </w:trPr>
+        <w:tc>
+          <w:tcPr>
+            <w:tcW w:type="dxa" w:w="3878"/>
+            <w:tcBorders>
+              <w:top w:val="single" w:color="BFBFBF" w:sz="4"/>
+              <w:left w:val="single" w:color="BFBFBF" w:sz="4"/>
+              <w:bottom w:val="single" w:color="BFBFBF" w:sz="4"/>
+              <w:right w:val="single" w:color="BFBFBF" w:sz="4"/>
+            </w:tcBorders>
+            <w:tcMar>
+              <w:top w:type="dxa" w:w="80"/>
+              <w:left w:type="dxa" w:w="120"/>
+              <w:bottom w:type="dxa" w:w="80"/>
+              <w:right w:type="dxa" w:w="120"/>
+            </w:tcMar>
+            <w:vAlign w:val="top"/>
+          </w:tcPr>
+          <w:p>
+            <w:pPr>
+              <w:spacing w:after="20" w:before="0" w:line="264"/>
+              <w:jc w:val="left"/>
+            </w:pPr>
+            <w:r>
+              <w:rPr>
+                <w:rFonts w:ascii="Arial" w:cs="Arial" w:eastAsia="Arial" w:hAnsi="Arial"/>
+                <w:b/>
+                <w:bCs/>
+                <w:sz w:val="18"/>
+                <w:szCs w:val="18"/>
+              </w:rPr>
+              <w:t xml:space="preserve">"Perdi o emprego."</w:t>
+            </w:r>
+          </w:p>
+        </w:tc>
+        <w:tc>
+          <w:tcPr>
+            <w:tcW w:type="dxa" w:w="6328"/>
+            <w:tcBorders>
+              <w:top w:val="single" w:color="BFBFBF" w:sz="4"/>
+              <w:left w:val="single" w:color="BFBFBF" w:sz="4"/>
+              <w:bottom w:val="single" w:color="BFBFBF" w:sz="4"/>
+              <w:right w:val="single" w:color="BFBFBF" w:sz="4"/>
+            </w:tcBorders>
+            <w:tcMar>
+              <w:top w:type="dxa" w:w="80"/>
+              <w:left w:type="dxa" w:w="120"/>
+              <w:bottom w:type="dxa" w:w="80"/>
+              <w:right w:type="dxa" w:w="120"/>
+            </w:tcMar>
+            <w:vAlign w:val="top"/>
+          </w:tcPr>
+          <w:p>
+            <w:pPr>
+              <w:spacing w:after="20" w:before="0" w:line="264"/>
+              <w:jc w:val="left"/>
+            </w:pPr>
+            <w:r>
+              <w:rPr>
+                <w:rFonts w:ascii="Arial" w:cs="Arial" w:eastAsia="Arial" w:hAnsi="Arial"/>
+                <w:b w:val="false"/>
+                <w:bCs w:val="false"/>
+                <w:sz w:val="18"/>
+                <w:szCs w:val="18"/>
+              </w:rPr>
+              <w:t xml:space="preserve">Item 7: </w:t>
+            </w:r>
+            <w:r>
+              <w:rPr>
+                <w:rFonts w:ascii="Arial" w:cs="Arial" w:eastAsia="Arial" w:hAnsi="Arial"/>
+                <w:b/>
+                <w:bCs/>
+                <w:sz w:val="18"/>
+                <w:szCs w:val="18"/>
+              </w:rPr>
+              <w:t xml:space="preserve">perda ou redução de renda</w:t>
+            </w:r>
+            <w:r>
+              <w:rPr>
+                <w:rFonts w:ascii="Arial" w:cs="Arial" w:eastAsia="Arial" w:hAnsi="Arial"/>
+                <w:b w:val="false"/>
+                <w:bCs w:val="false"/>
+                <w:sz w:val="18"/>
+                <w:szCs w:val="18"/>
+              </w:rPr>
+              <w:t xml:space="preserve"> é motivo ligado ao comprador, com as deduções do quadro-resumo.</w:t>
+            </w:r>
+          </w:p>
+        </w:tc>
+      </w:tr>
+      <w:tr>
+        <w:trPr>
+          <w:cantSplit/>
+        </w:trPr>
+        <w:tc>
+          <w:tcPr>
+            <w:tcW w:type="dxa" w:w="3878"/>
+            <w:tcBorders>
+              <w:top w:val="single" w:color="BFBFBF" w:sz="4"/>
+              <w:left w:val="single" w:color="BFBFBF" w:sz="4"/>
+              <w:bottom w:val="single" w:color="BFBFBF" w:sz="4"/>
+              <w:right w:val="single" w:color="BFBFBF" w:sz="4"/>
+            </w:tcBorders>
+            <w:tcMar>
+              <w:top w:type="dxa" w:w="80"/>
+              <w:left w:type="dxa" w:w="120"/>
+              <w:bottom w:type="dxa" w:w="80"/>
+              <w:right w:type="dxa" w:w="120"/>
+            </w:tcMar>
+            <w:vAlign w:val="top"/>
+          </w:tcPr>
+          <w:p>
+            <w:pPr>
+              <w:spacing w:after="20" w:before="0" w:line="264"/>
+              <w:jc w:val="left"/>
+            </w:pPr>
+            <w:r>
+              <w:rPr>
+                <w:rFonts w:ascii="Arial" w:cs="Arial" w:eastAsia="Arial" w:hAnsi="Arial"/>
+                <w:b/>
+                <w:bCs/>
+                <w:sz w:val="18"/>
+                <w:szCs w:val="18"/>
+              </w:rPr>
+              <w:t xml:space="preserve">Enrolar com prazos sucessivos</w:t>
+            </w:r>
+          </w:p>
+        </w:tc>
+        <w:tc>
+          <w:tcPr>
+            <w:tcW w:type="dxa" w:w="6328"/>
+            <w:tcBorders>
+              <w:top w:val="single" w:color="BFBFBF" w:sz="4"/>
+              <w:left w:val="single" w:color="BFBFBF" w:sz="4"/>
+              <w:bottom w:val="single" w:color="BFBFBF" w:sz="4"/>
+              <w:right w:val="single" w:color="BFBFBF" w:sz="4"/>
+            </w:tcBorders>
+            <w:tcMar>
+              <w:top w:type="dxa" w:w="80"/>
+              <w:left w:type="dxa" w:w="120"/>
+              <w:bottom w:type="dxa" w:w="80"/>
+              <w:right w:type="dxa" w:w="120"/>
+            </w:tcMar>
+            <w:vAlign w:val="top"/>
+          </w:tcPr>
+          <w:p>
+            <w:pPr>
+              <w:spacing w:after="20" w:before="0" w:line="264"/>
+              <w:jc w:val="left"/>
+            </w:pPr>
+            <w:r>
+              <w:rPr>
+                <w:rFonts w:ascii="Arial" w:cs="Arial" w:eastAsia="Arial" w:hAnsi="Arial"/>
+                <w:b w:val="false"/>
+                <w:bCs w:val="false"/>
+                <w:sz w:val="18"/>
+                <w:szCs w:val="18"/>
+              </w:rPr>
+              <w:t xml:space="preserve">Item 6: </w:t>
+            </w:r>
+            <w:r>
+              <w:rPr>
+                <w:rFonts w:ascii="Arial" w:cs="Arial" w:eastAsia="Arial" w:hAnsi="Arial"/>
+                <w:b/>
+                <w:bCs/>
+                <w:sz w:val="18"/>
+                <w:szCs w:val="18"/>
+              </w:rPr>
+              <w:t xml:space="preserve">um único prazo de 30 dias</w:t>
+            </w:r>
+            <w:r>
+              <w:rPr>
+                <w:rFonts w:ascii="Arial" w:cs="Arial" w:eastAsia="Arial" w:hAnsi="Arial"/>
+                <w:b w:val="false"/>
+                <w:bCs w:val="false"/>
+                <w:sz w:val="18"/>
+                <w:szCs w:val="18"/>
+              </w:rPr>
+              <w:t xml:space="preserve"> (15 perto das chaves); nova chance só se a vendedora quiser.</w:t>
+            </w:r>
+          </w:p>
+        </w:tc>
+      </w:tr>
+      <w:tr>
+        <w:trPr>
+          <w:cantSplit/>
+        </w:trPr>
+        <w:tc>
+          <w:tcPr>
+            <w:tcW w:type="dxa" w:w="3878"/>
+            <w:tcBorders>
+              <w:top w:val="single" w:color="BFBFBF" w:sz="4"/>
+              <w:left w:val="single" w:color="BFBFBF" w:sz="4"/>
+              <w:bottom w:val="single" w:color="BFBFBF" w:sz="4"/>
+              <w:right w:val="single" w:color="BFBFBF" w:sz="4"/>
+            </w:tcBorders>
+            <w:tcMar>
+              <w:top w:type="dxa" w:w="80"/>
+              <w:left w:type="dxa" w:w="120"/>
+              <w:bottom w:type="dxa" w:w="80"/>
+              <w:right w:type="dxa" w:w="120"/>
+            </w:tcMar>
+            <w:vAlign w:val="top"/>
+          </w:tcPr>
+          <w:p>
+            <w:pPr>
+              <w:spacing w:after="20" w:before="0" w:line="264"/>
+              <w:jc w:val="left"/>
+            </w:pPr>
+            <w:r>
+              <w:rPr>
+                <w:rFonts w:ascii="Arial" w:cs="Arial" w:eastAsia="Arial" w:hAnsi="Arial"/>
+                <w:b/>
+                <w:bCs/>
+                <w:sz w:val="18"/>
+                <w:szCs w:val="18"/>
+              </w:rPr>
+              <w:t xml:space="preserve">"Não recebi o aviso."</w:t>
+            </w:r>
+          </w:p>
+        </w:tc>
+        <w:tc>
+          <w:tcPr>
+            <w:tcW w:type="dxa" w:w="6328"/>
+            <w:tcBorders>
+              <w:top w:val="single" w:color="BFBFBF" w:sz="4"/>
+              <w:left w:val="single" w:color="BFBFBF" w:sz="4"/>
+              <w:bottom w:val="single" w:color="BFBFBF" w:sz="4"/>
+              <w:right w:val="single" w:color="BFBFBF" w:sz="4"/>
+            </w:tcBorders>
+            <w:tcMar>
+              <w:top w:type="dxa" w:w="80"/>
+              <w:left w:type="dxa" w:w="120"/>
+              <w:bottom w:type="dxa" w:w="80"/>
+              <w:right w:type="dxa" w:w="120"/>
+            </w:tcMar>
+            <w:vAlign w:val="top"/>
+          </w:tcPr>
+          <w:p>
+            <w:pPr>
+              <w:spacing w:after="20" w:before="0" w:line="264"/>
+              <w:jc w:val="left"/>
+            </w:pPr>
+            <w:r>
+              <w:rPr>
+                <w:rFonts w:ascii="Arial" w:cs="Arial" w:eastAsia="Arial" w:hAnsi="Arial"/>
+                <w:b w:val="false"/>
+                <w:bCs w:val="false"/>
+                <w:sz w:val="18"/>
+                <w:szCs w:val="18"/>
+              </w:rPr>
+              <w:t xml:space="preserve">Item 4.8: avisos aos contatos do Termo contam como recebidos; o desfazimento usa notificação formal, que tem prova própria.</w:t>
+            </w:r>
+          </w:p>
+        </w:tc>
+      </w:tr>
+      <w:tr>
+        <w:trPr>
+          <w:cantSplit/>
+        </w:trPr>
+        <w:tc>
+          <w:tcPr>
+            <w:tcW w:type="dxa" w:w="3878"/>
+            <w:tcBorders>
+              <w:top w:val="single" w:color="BFBFBF" w:sz="4"/>
+              <w:left w:val="single" w:color="BFBFBF" w:sz="4"/>
+              <w:bottom w:val="single" w:color="BFBFBF" w:sz="4"/>
+              <w:right w:val="single" w:color="BFBFBF" w:sz="4"/>
+            </w:tcBorders>
+            <w:tcMar>
+              <w:top w:type="dxa" w:w="80"/>
+              <w:left w:type="dxa" w:w="120"/>
+              <w:bottom w:type="dxa" w:w="80"/>
+              <w:right w:type="dxa" w:w="120"/>
+            </w:tcMar>
+            <w:vAlign w:val="top"/>
+          </w:tcPr>
+          <w:p>
+            <w:pPr>
+              <w:spacing w:after="20" w:before="0" w:line="264"/>
+              <w:jc w:val="left"/>
+            </w:pPr>
+            <w:r>
+              <w:rPr>
+                <w:rFonts w:ascii="Arial" w:cs="Arial" w:eastAsia="Arial" w:hAnsi="Arial"/>
+                <w:b/>
+                <w:bCs/>
+                <w:sz w:val="18"/>
+                <w:szCs w:val="18"/>
+              </w:rPr>
+              <w:t xml:space="preserve">Não comparecer para assinar o financiamento ou não entregar documentos</w:t>
+            </w:r>
+          </w:p>
+        </w:tc>
+        <w:tc>
+          <w:tcPr>
+            <w:tcW w:type="dxa" w:w="6328"/>
+            <w:tcBorders>
+              <w:top w:val="single" w:color="BFBFBF" w:sz="4"/>
+              <w:left w:val="single" w:color="BFBFBF" w:sz="4"/>
+              <w:bottom w:val="single" w:color="BFBFBF" w:sz="4"/>
+              <w:right w:val="single" w:color="BFBFBF" w:sz="4"/>
+            </w:tcBorders>
+            <w:tcMar>
+              <w:top w:type="dxa" w:w="80"/>
+              <w:left w:type="dxa" w:w="120"/>
+              <w:bottom w:type="dxa" w:w="80"/>
+              <w:right w:type="dxa" w:w="120"/>
+            </w:tcMar>
+            <w:vAlign w:val="top"/>
+          </w:tcPr>
+          <w:p>
+            <w:pPr>
+              <w:spacing w:after="20" w:before="0" w:line="264"/>
+              <w:jc w:val="left"/>
+            </w:pPr>
+            <w:r>
+              <w:rPr>
+                <w:rFonts w:ascii="Arial" w:cs="Arial" w:eastAsia="Arial" w:hAnsi="Arial"/>
+                <w:b w:val="false"/>
+                <w:bCs w:val="false"/>
+                <w:sz w:val="18"/>
+                <w:szCs w:val="18"/>
+              </w:rPr>
+              <w:t xml:space="preserve">Item 4.7: prazos de 5 dias úteis e 10 dias; faltar sem justificativa é descumprimento.</w:t>
+            </w:r>
+          </w:p>
+        </w:tc>
+      </w:tr>
+      <w:tr>
+        <w:trPr>
+          <w:cantSplit/>
+        </w:trPr>
+        <w:tc>
+          <w:tcPr>
+            <w:tcW w:type="dxa" w:w="3878"/>
+            <w:tcBorders>
+              <w:top w:val="single" w:color="BFBFBF" w:sz="4"/>
+              <w:left w:val="single" w:color="BFBFBF" w:sz="4"/>
+              <w:bottom w:val="single" w:color="BFBFBF" w:sz="4"/>
+              <w:right w:val="single" w:color="BFBFBF" w:sz="4"/>
+            </w:tcBorders>
+            <w:tcMar>
+              <w:top w:type="dxa" w:w="80"/>
+              <w:left w:type="dxa" w:w="120"/>
+              <w:bottom w:type="dxa" w:w="80"/>
+              <w:right w:type="dxa" w:w="120"/>
+            </w:tcMar>
+            <w:vAlign w:val="top"/>
+          </w:tcPr>
+          <w:p>
+            <w:pPr>
+              <w:spacing w:after="20" w:before="0" w:line="264"/>
+              <w:jc w:val="left"/>
+            </w:pPr>
+            <w:r>
+              <w:rPr>
+                <w:rFonts w:ascii="Arial" w:cs="Arial" w:eastAsia="Arial" w:hAnsi="Arial"/>
+                <w:b/>
+                <w:bCs/>
+                <w:sz w:val="18"/>
+                <w:szCs w:val="18"/>
+              </w:rPr>
+              <w:t xml:space="preserve">"A restrição era do outro comprador."</w:t>
+            </w:r>
+          </w:p>
+        </w:tc>
+        <w:tc>
+          <w:tcPr>
+            <w:tcW w:type="dxa" w:w="6328"/>
+            <w:tcBorders>
+              <w:top w:val="single" w:color="BFBFBF" w:sz="4"/>
+              <w:left w:val="single" w:color="BFBFBF" w:sz="4"/>
+              <w:bottom w:val="single" w:color="BFBFBF" w:sz="4"/>
+              <w:right w:val="single" w:color="BFBFBF" w:sz="4"/>
+            </w:tcBorders>
+            <w:tcMar>
+              <w:top w:type="dxa" w:w="80"/>
+              <w:left w:type="dxa" w:w="120"/>
+              <w:bottom w:type="dxa" w:w="80"/>
+              <w:right w:type="dxa" w:w="120"/>
+            </w:tcMar>
+            <w:vAlign w:val="top"/>
+          </w:tcPr>
+          <w:p>
+            <w:pPr>
+              <w:spacing w:after="20" w:before="0" w:line="264"/>
+              <w:jc w:val="left"/>
+            </w:pPr>
+            <w:r>
+              <w:rPr>
+                <w:rFonts w:ascii="Arial" w:cs="Arial" w:eastAsia="Arial" w:hAnsi="Arial"/>
+                <w:b w:val="false"/>
+                <w:bCs w:val="false"/>
+                <w:sz w:val="18"/>
+                <w:szCs w:val="18"/>
+              </w:rPr>
+              <w:t xml:space="preserve">Cabeçalho: solidariedade e restrição de </w:t>
+            </w:r>
+            <w:r>
+              <w:rPr>
+                <w:rFonts w:ascii="Arial" w:cs="Arial" w:eastAsia="Arial" w:hAnsi="Arial"/>
+                <w:b/>
+                <w:bCs/>
+                <w:sz w:val="18"/>
+                <w:szCs w:val="18"/>
+              </w:rPr>
+              <w:t xml:space="preserve">qualquer</w:t>
+            </w:r>
+            <w:r>
+              <w:rPr>
+                <w:rFonts w:ascii="Arial" w:cs="Arial" w:eastAsia="Arial" w:hAnsi="Arial"/>
+                <w:b w:val="false"/>
+                <w:bCs w:val="false"/>
+                <w:sz w:val="18"/>
+                <w:szCs w:val="18"/>
+              </w:rPr>
+              <w:t xml:space="preserve"> comprador vale para ambos.</w:t>
+            </w:r>
+          </w:p>
+        </w:tc>
+      </w:tr>
+      <w:tr>
+        <w:trPr>
+          <w:cantSplit/>
+        </w:trPr>
+        <w:tc>
+          <w:tcPr>
+            <w:tcW w:type="dxa" w:w="3878"/>
+            <w:tcBorders>
+              <w:top w:val="single" w:color="BFBFBF" w:sz="4"/>
+              <w:left w:val="single" w:color="BFBFBF" w:sz="4"/>
+              <w:bottom w:val="single" w:color="BFBFBF" w:sz="4"/>
+              <w:right w:val="single" w:color="BFBFBF" w:sz="4"/>
+            </w:tcBorders>
+            <w:tcMar>
+              <w:top w:type="dxa" w:w="80"/>
+              <w:left w:type="dxa" w:w="120"/>
+              <w:bottom w:type="dxa" w:w="80"/>
+              <w:right w:type="dxa" w:w="120"/>
+            </w:tcMar>
+            <w:vAlign w:val="top"/>
+          </w:tcPr>
+          <w:p>
+            <w:pPr>
+              <w:spacing w:after="20" w:before="0" w:line="264"/>
+              <w:jc w:val="left"/>
+            </w:pPr>
+            <w:r>
+              <w:rPr>
+                <w:rFonts w:ascii="Arial" w:cs="Arial" w:eastAsia="Arial" w:hAnsi="Arial"/>
+                <w:b/>
+                <w:bCs/>
+                <w:sz w:val="18"/>
+                <w:szCs w:val="18"/>
+              </w:rPr>
+              <w:t xml:space="preserve">Pedir as chaves antes de pagar o saldo</w:t>
+            </w:r>
+          </w:p>
+        </w:tc>
+        <w:tc>
+          <w:tcPr>
+            <w:tcW w:type="dxa" w:w="6328"/>
+            <w:tcBorders>
+              <w:top w:val="single" w:color="BFBFBF" w:sz="4"/>
+              <w:left w:val="single" w:color="BFBFBF" w:sz="4"/>
+              <w:bottom w:val="single" w:color="BFBFBF" w:sz="4"/>
+              <w:right w:val="single" w:color="BFBFBF" w:sz="4"/>
+            </w:tcBorders>
+            <w:tcMar>
+              <w:top w:type="dxa" w:w="80"/>
+              <w:left w:type="dxa" w:w="120"/>
+              <w:bottom w:type="dxa" w:w="80"/>
+              <w:right w:type="dxa" w:w="120"/>
+            </w:tcMar>
+            <w:vAlign w:val="top"/>
+          </w:tcPr>
+          <w:p>
+            <w:pPr>
+              <w:spacing w:after="20" w:before="0" w:line="264"/>
+              <w:jc w:val="left"/>
+            </w:pPr>
+            <w:r>
+              <w:rPr>
+                <w:rFonts w:ascii="Arial" w:cs="Arial" w:eastAsia="Arial" w:hAnsi="Arial"/>
+                <w:b w:val="false"/>
+                <w:bCs w:val="false"/>
+                <w:sz w:val="18"/>
+                <w:szCs w:val="18"/>
+              </w:rPr>
+              <w:t xml:space="preserve">Item 1.5: chaves só após assinatura do financiamento ou pagamento.</w:t>
+            </w:r>
+          </w:p>
+        </w:tc>
+      </w:tr>
+      <w:tr>
+        <w:trPr>
+          <w:cantSplit/>
+        </w:trPr>
+        <w:tc>
+          <w:tcPr>
+            <w:tcW w:type="dxa" w:w="3878"/>
+            <w:tcBorders>
+              <w:top w:val="single" w:color="BFBFBF" w:sz="4"/>
+              <w:left w:val="single" w:color="BFBFBF" w:sz="4"/>
+              <w:bottom w:val="single" w:color="BFBFBF" w:sz="4"/>
+              <w:right w:val="single" w:color="BFBFBF" w:sz="4"/>
+            </w:tcBorders>
+            <w:tcMar>
+              <w:top w:type="dxa" w:w="80"/>
+              <w:left w:type="dxa" w:w="120"/>
+              <w:bottom w:type="dxa" w:w="80"/>
+              <w:right w:type="dxa" w:w="120"/>
+            </w:tcMar>
+            <w:vAlign w:val="top"/>
+          </w:tcPr>
+          <w:p>
+            <w:pPr>
+              <w:spacing w:after="20" w:before="0" w:line="264"/>
+              <w:jc w:val="left"/>
+            </w:pPr>
+            <w:r>
+              <w:rPr>
+                <w:rFonts w:ascii="Arial" w:cs="Arial" w:eastAsia="Arial" w:hAnsi="Arial"/>
+                <w:b/>
+                <w:bCs/>
+                <w:sz w:val="18"/>
+                <w:szCs w:val="18"/>
+              </w:rPr>
+              <w:t xml:space="preserve">Revogar a autorização de consulta (LGPD)</w:t>
+            </w:r>
+          </w:p>
+        </w:tc>
+        <w:tc>
+          <w:tcPr>
+            <w:tcW w:type="dxa" w:w="6328"/>
+            <w:tcBorders>
+              <w:top w:val="single" w:color="BFBFBF" w:sz="4"/>
+              <w:left w:val="single" w:color="BFBFBF" w:sz="4"/>
+              <w:bottom w:val="single" w:color="BFBFBF" w:sz="4"/>
+              <w:right w:val="single" w:color="BFBFBF" w:sz="4"/>
+            </w:tcBorders>
+            <w:tcMar>
+              <w:top w:type="dxa" w:w="80"/>
+              <w:left w:type="dxa" w:w="120"/>
+              <w:bottom w:type="dxa" w:w="80"/>
+              <w:right w:type="dxa" w:w="120"/>
+            </w:tcMar>
+            <w:vAlign w:val="top"/>
+          </w:tcPr>
+          <w:p>
+            <w:pPr>
+              <w:spacing w:after="20" w:before="0" w:line="264"/>
+              <w:jc w:val="left"/>
+            </w:pPr>
+            <w:r>
+              <w:rPr>
+                <w:rFonts w:ascii="Arial" w:cs="Arial" w:eastAsia="Arial" w:hAnsi="Arial"/>
+                <w:b w:val="false"/>
+                <w:bCs w:val="false"/>
+                <w:sz w:val="18"/>
+                <w:szCs w:val="18"/>
+              </w:rPr>
+              <w:t xml:space="preserve">Item 5: base legal de contrato e proteção do crédito, sem consentimento revogável; autorização expressa de consulta ao SCR.</w:t>
+            </w:r>
+          </w:p>
+        </w:tc>
+      </w:tr>
+      <w:tr>
+        <w:trPr>
+          <w:cantSplit/>
+        </w:trPr>
+        <w:tc>
+          <w:tcPr>
+            <w:tcW w:type="dxa" w:w="3878"/>
+            <w:tcBorders>
+              <w:top w:val="single" w:color="BFBFBF" w:sz="4"/>
+              <w:left w:val="single" w:color="BFBFBF" w:sz="4"/>
+              <w:bottom w:val="single" w:color="BFBFBF" w:sz="4"/>
+              <w:right w:val="single" w:color="BFBFBF" w:sz="4"/>
+            </w:tcBorders>
+            <w:tcMar>
+              <w:top w:type="dxa" w:w="80"/>
+              <w:left w:type="dxa" w:w="120"/>
+              <w:bottom w:type="dxa" w:w="80"/>
+              <w:right w:type="dxa" w:w="120"/>
+            </w:tcMar>
+            <w:vAlign w:val="top"/>
+          </w:tcPr>
+          <w:p>
+            <w:pPr>
+              <w:spacing w:after="20" w:before="0" w:line="264"/>
+              <w:jc w:val="left"/>
+            </w:pPr>
+            <w:r>
+              <w:rPr>
+                <w:rFonts w:ascii="Arial" w:cs="Arial" w:eastAsia="Arial" w:hAnsi="Arial"/>
+                <w:b/>
+                <w:bCs/>
+                <w:sz w:val="18"/>
+                <w:szCs w:val="18"/>
+              </w:rPr>
+              <w:t xml:space="preserve">Anular o Termo inteiro por uma cláusula abusiva</w:t>
+            </w:r>
+          </w:p>
+        </w:tc>
+        <w:tc>
+          <w:tcPr>
+            <w:tcW w:type="dxa" w:w="6328"/>
+            <w:tcBorders>
+              <w:top w:val="single" w:color="BFBFBF" w:sz="4"/>
+              <w:left w:val="single" w:color="BFBFBF" w:sz="4"/>
+              <w:bottom w:val="single" w:color="BFBFBF" w:sz="4"/>
+              <w:right w:val="single" w:color="BFBFBF" w:sz="4"/>
+            </w:tcBorders>
+            <w:tcMar>
+              <w:top w:type="dxa" w:w="80"/>
+              <w:left w:type="dxa" w:w="120"/>
+              <w:bottom w:type="dxa" w:w="80"/>
+              <w:right w:type="dxa" w:w="120"/>
+            </w:tcMar>
+            <w:vAlign w:val="top"/>
+          </w:tcPr>
+          <w:p>
+            <w:pPr>
+              <w:spacing w:after="20" w:before="0" w:line="264"/>
+              <w:jc w:val="left"/>
+            </w:pPr>
+            <w:r>
+              <w:rPr>
+                <w:rFonts w:ascii="Arial" w:cs="Arial" w:eastAsia="Arial" w:hAnsi="Arial"/>
+                <w:b w:val="false"/>
+                <w:bCs w:val="false"/>
+                <w:sz w:val="18"/>
+                <w:szCs w:val="18"/>
+              </w:rPr>
+              <w:t xml:space="preserve">Cláusula de conservação: se uma cláusula cair, as outras continuam.</w:t>
+            </w:r>
+          </w:p>
+        </w:tc>
+      </w:tr>
+    </w:tbl>
+    <w:p>
+      <w:pPr>
+        <w:spacing w:after="120"/>
+      </w:pPr>
+    </w:p>
+    <w:p>
+      <w:pPr>
+        <w:keepNext/>
+        <w:pBdr>
+          <w:bottom w:val="single" w:color="1F3864" w:sz="8"/>
+        </w:pBdr>
+        <w:spacing w:after="100" w:before="240"/>
+      </w:pPr>
+      <w:r>
+        <w:rPr>
+          <w:rFonts w:ascii="Arial" w:cs="Arial" w:eastAsia="Arial" w:hAnsi="Arial"/>
+          <w:b/>
+          <w:bCs/>
+          <w:color w:val="1F3864"/>
+          <w:sz w:val="24"/>
+          <w:szCs w:val="24"/>
+        </w:rPr>
+        <w:t xml:space="preserve">6. Limites: o que não entrou, e por quê</w:t>
+      </w:r>
+    </w:p>
+    <w:p>
+      <w:pPr>
+        <w:spacing w:after="100" w:before="0" w:line="264"/>
+        <w:jc w:val="left"/>
+      </w:pPr>
+      <w:r>
+        <w:rPr>
+          <w:rFonts w:ascii="Arial" w:cs="Arial" w:eastAsia="Arial" w:hAnsi="Arial"/>
+          <w:sz w:val="20"/>
+          <w:szCs w:val="20"/>
+        </w:rPr>
+        <w:t xml:space="preserve">Estas cláusulas parecem mais "duras", mas seriam anuladas pelo Judiciário e dariam argumento para questionar o Termo inteiro:</w:t>
+      </w:r>
+    </w:p>
+    <w:p>
+      <w:pPr>
+        <w:pStyle w:val="ListParagraph"/>
+        <w:numPr>
+          <w:ilvl w:val="0"/>
+          <w:numId w:val="2"/>
+        </w:numPr>
+        <w:spacing w:after="50" w:before="0" w:line="264"/>
+        <w:jc w:val="left"/>
+      </w:pPr>
+      <w:r>
+        <w:rPr>
+          <w:rFonts w:ascii="Arial" w:cs="Arial" w:eastAsia="Arial" w:hAnsi="Arial"/>
+          <w:b/>
+          <w:bCs/>
+          <w:sz w:val="20"/>
+          <w:szCs w:val="20"/>
+        </w:rPr>
+        <w:t xml:space="preserve">Proibir o cliente de fazer qualquer dívida:</w:t>
+      </w:r>
+      <w:r>
+        <w:rPr>
+          <w:rFonts w:ascii="Arial" w:cs="Arial" w:eastAsia="Arial" w:hAnsi="Arial"/>
+          <w:sz w:val="20"/>
+          <w:szCs w:val="20"/>
+        </w:rPr>
+        <w:t xml:space="preserve"> interfere na vida financeira do consumidor além do necessário (CDC, art. 51, IV). A v4 exige aviso prévio e transfere o risco — mesmo efeito prático, sem nulidade.</w:t>
+      </w:r>
+    </w:p>
+    <w:p>
+      <w:pPr>
+        <w:pStyle w:val="ListParagraph"/>
+        <w:numPr>
+          <w:ilvl w:val="0"/>
+          <w:numId w:val="2"/>
+        </w:numPr>
+        <w:spacing w:after="50" w:before="0" w:line="264"/>
+        <w:jc w:val="left"/>
+      </w:pPr>
+      <w:r>
+        <w:rPr>
+          <w:rFonts w:ascii="Arial" w:cs="Arial" w:eastAsia="Arial" w:hAnsi="Arial"/>
+          <w:b/>
+          <w:bCs/>
+          <w:sz w:val="20"/>
+          <w:szCs w:val="20"/>
+        </w:rPr>
+        <w:t xml:space="preserve">Reter 100% ou mais que o quadro-resumo:</w:t>
+      </w:r>
+      <w:r>
+        <w:rPr>
+          <w:rFonts w:ascii="Arial" w:cs="Arial" w:eastAsia="Arial" w:hAnsi="Arial"/>
+          <w:sz w:val="20"/>
+          <w:szCs w:val="20"/>
+        </w:rPr>
+        <w:t xml:space="preserve"> a Lei 13.786/2018 limita a 25% (até 50% com afetação, em discussão no STJ). Multa extra no Termo seria cobrança em duplicidade.</w:t>
+      </w:r>
+    </w:p>
+    <w:p>
+      <w:pPr>
+        <w:pStyle w:val="ListParagraph"/>
+        <w:numPr>
+          <w:ilvl w:val="0"/>
+          <w:numId w:val="2"/>
+        </w:numPr>
+        <w:spacing w:after="50" w:before="0" w:line="264"/>
+        <w:jc w:val="left"/>
+      </w:pPr>
+      <w:r>
+        <w:rPr>
+          <w:rFonts w:ascii="Arial" w:cs="Arial" w:eastAsia="Arial" w:hAnsi="Arial"/>
+          <w:b/>
+          <w:bCs/>
+          <w:sz w:val="20"/>
+          <w:szCs w:val="20"/>
+        </w:rPr>
+        <w:t xml:space="preserve">Desfazer o contrato só com aviso por WhatsApp:</w:t>
+      </w:r>
+      <w:r>
+        <w:rPr>
+          <w:rFonts w:ascii="Arial" w:cs="Arial" w:eastAsia="Arial" w:hAnsi="Arial"/>
+          <w:sz w:val="20"/>
+          <w:szCs w:val="20"/>
+        </w:rPr>
+        <w:t xml:space="preserve"> a lei exige notificação judicial ou por cartório com 15 dias (Decreto-Lei 745/1969).</w:t>
+      </w:r>
+    </w:p>
+    <w:p>
+      <w:pPr>
+        <w:pStyle w:val="ListParagraph"/>
+        <w:numPr>
+          <w:ilvl w:val="0"/>
+          <w:numId w:val="2"/>
+        </w:numPr>
+        <w:spacing w:after="50" w:before="0" w:line="264"/>
+        <w:jc w:val="left"/>
+      </w:pPr>
+      <w:r>
+        <w:rPr>
+          <w:rFonts w:ascii="Arial" w:cs="Arial" w:eastAsia="Arial" w:hAnsi="Arial"/>
+          <w:b/>
+          <w:bCs/>
+          <w:sz w:val="20"/>
+          <w:szCs w:val="20"/>
+        </w:rPr>
+        <w:t xml:space="preserve">Renunciar ao arrependimento de 7 dias:</w:t>
+      </w:r>
+      <w:r>
+        <w:rPr>
+          <w:rFonts w:ascii="Arial" w:cs="Arial" w:eastAsia="Arial" w:hAnsi="Arial"/>
+          <w:sz w:val="20"/>
+          <w:szCs w:val="20"/>
+        </w:rPr>
+        <w:t xml:space="preserve"> direito legal irrenunciável (art. 67-A, § 10).</w:t>
+      </w:r>
+    </w:p>
+    <w:p>
+      <w:pPr>
+        <w:pStyle w:val="ListParagraph"/>
+        <w:numPr>
+          <w:ilvl w:val="0"/>
+          <w:numId w:val="2"/>
+        </w:numPr>
+        <w:spacing w:after="50" w:before="0" w:line="264"/>
+        <w:jc w:val="left"/>
+      </w:pPr>
+      <w:r>
+        <w:rPr>
+          <w:rFonts w:ascii="Arial" w:cs="Arial" w:eastAsia="Arial" w:hAnsi="Arial"/>
+          <w:b/>
+          <w:bCs/>
+          <w:sz w:val="20"/>
+          <w:szCs w:val="20"/>
+        </w:rPr>
+        <w:t xml:space="preserve">Cobrar condomínio e IPTU antes das chaves:</w:t>
+      </w:r>
+      <w:r>
+        <w:rPr>
+          <w:rFonts w:ascii="Arial" w:cs="Arial" w:eastAsia="Arial" w:hAnsi="Arial"/>
+          <w:sz w:val="20"/>
+          <w:szCs w:val="20"/>
+        </w:rPr>
+        <w:t xml:space="preserve"> a jurisprudência atribui esses encargos a quem tem a posse.</w:t>
+      </w:r>
+    </w:p>
+    <w:p>
+      <w:pPr>
+        <w:pStyle w:val="ListParagraph"/>
+        <w:numPr>
+          <w:ilvl w:val="0"/>
+          <w:numId w:val="2"/>
+        </w:numPr>
+        <w:spacing w:after="50" w:before="0" w:line="264"/>
+        <w:jc w:val="left"/>
+      </w:pPr>
+      <w:r>
+        <w:rPr>
+          <w:rFonts w:ascii="Arial" w:cs="Arial" w:eastAsia="Arial" w:hAnsi="Arial"/>
+          <w:b/>
+          <w:bCs/>
+          <w:sz w:val="20"/>
+          <w:szCs w:val="20"/>
+        </w:rPr>
+        <w:t xml:space="preserve">Foro em outra cidade:</w:t>
+      </w:r>
+      <w:r>
+        <w:rPr>
+          <w:rFonts w:ascii="Arial" w:cs="Arial" w:eastAsia="Arial" w:hAnsi="Arial"/>
+          <w:sz w:val="20"/>
+          <w:szCs w:val="20"/>
+        </w:rPr>
+        <w:t xml:space="preserve"> em contrato de adesão vale o domicílio do consumidor (CDC, art. 101, I).</w:t>
+      </w:r>
+    </w:p>
+    <w:p>
+      <w:pPr>
+        <w:pStyle w:val="ListParagraph"/>
+        <w:numPr>
+          <w:ilvl w:val="0"/>
+          <w:numId w:val="2"/>
+        </w:numPr>
+        <w:spacing w:after="50" w:before="0" w:line="264"/>
+        <w:jc w:val="left"/>
+      </w:pPr>
+      <w:r>
+        <w:rPr>
+          <w:rFonts w:ascii="Arial" w:cs="Arial" w:eastAsia="Arial" w:hAnsi="Arial"/>
+          <w:b/>
+          <w:bCs/>
+          <w:sz w:val="20"/>
+          <w:szCs w:val="20"/>
+        </w:rPr>
+        <w:t xml:space="preserve">Linguagem ambígua:</w:t>
+      </w:r>
+      <w:r>
+        <w:rPr>
+          <w:rFonts w:ascii="Arial" w:cs="Arial" w:eastAsia="Arial" w:hAnsi="Arial"/>
+          <w:sz w:val="20"/>
+          <w:szCs w:val="20"/>
+        </w:rPr>
+        <w:t xml:space="preserve"> no CDC, a dúvida é resolvida a favor do consumidor (art. 47). Por isso a v4 usa listas fechadas e prazos em números.</w:t>
+      </w:r>
+    </w:p>
+    <w:p>
+      <w:pPr>
+        <w:keepNext/>
+        <w:pBdr>
+          <w:bottom w:val="single" w:color="1F3864" w:sz="8"/>
+        </w:pBdr>
+        <w:spacing w:after="100" w:before="240"/>
+      </w:pPr>
+      <w:r>
+        <w:rPr>
+          <w:rFonts w:ascii="Arial" w:cs="Arial" w:eastAsia="Arial" w:hAnsi="Arial"/>
+          <w:b/>
+          <w:bCs/>
+          <w:color w:val="1F3864"/>
+          <w:sz w:val="24"/>
+          <w:szCs w:val="24"/>
+        </w:rPr>
+        <w:t xml:space="preserve">7. Normas e jurisprudência consultadas</w:t>
       </w:r>
     </w:p>
     <w:tbl>

</xml_diff>